<commit_message>
Add files via upload
</commit_message>
<xml_diff>
--- a/пр2.docx
+++ b/пр2.docx
@@ -1,6 +1,6 @@
 
 <file path=word/document.xml><?xml version="1.0" encoding="utf-8"?>
-<w:document xmlns:wpc="http://schemas.microsoft.com/office/word/2010/wordprocessingCanvas" xmlns:cx="http://schemas.microsoft.com/office/drawing/2014/chartex" xmlns:cx1="http://schemas.microsoft.com/office/drawing/2015/9/8/chartex" xmlns:cx2="http://schemas.microsoft.com/office/drawing/2015/10/21/chartex" xmlns:cx3="http://schemas.microsoft.com/office/drawing/2016/5/9/chartex" xmlns:cx4="http://schemas.microsoft.com/office/drawing/2016/5/10/chartex" xmlns:cx5="http://schemas.microsoft.com/office/drawing/2016/5/11/chartex" xmlns:cx6="http://schemas.microsoft.com/office/drawing/2016/5/12/chartex" xmlns:cx7="http://schemas.microsoft.com/office/drawing/2016/5/13/chartex" xmlns:cx8="http://schemas.microsoft.com/office/drawing/2016/5/14/chartex" xmlns:mc="http://schemas.openxmlformats.org/markup-compatibility/2006" xmlns:aink="http://schemas.microsoft.com/office/drawing/2016/ink" xmlns:am3d="http://schemas.microsoft.com/office/drawing/2017/model3d" xmlns:o="urn:schemas-microsoft-com:office:office" xmlns:oel="http://schemas.microsoft.com/office/2019/extlst" xmlns:r="http://schemas.openxmlformats.org/officeDocument/2006/relationships" xmlns:m="http://schemas.openxmlformats.org/officeDocument/2006/math" xmlns:v="urn:schemas-microsoft-com:vml" xmlns:wp14="http://schemas.microsoft.com/office/word/2010/wordprocessingDrawing" xmlns:wp="http://schemas.openxmlformats.org/drawingml/2006/wordprocessingDrawing" xmlns:w10="urn:schemas-microsoft-com:office:word" xmlns:w="http://schemas.openxmlformats.org/wordprocessingml/2006/main" xmlns:w14="http://schemas.microsoft.com/office/word/2010/wordml" xmlns:w15="http://schemas.microsoft.com/office/word/2012/wordml" xmlns:w16cex="http://schemas.microsoft.com/office/word/2018/wordml/cex" xmlns:w16cid="http://schemas.microsoft.com/office/word/2016/wordml/cid" xmlns:w16="http://schemas.microsoft.com/office/word/2018/wordml" xmlns:w16du="http://schemas.microsoft.com/office/word/2023/wordml/word16du" xmlns:w16sdtdh="http://schemas.microsoft.com/office/word/2020/wordml/sdtdatahash" xmlns:w16sdtfl="http://schemas.microsoft.com/office/word/2024/wordml/sdtformatlock" xmlns:w16se="http://schemas.microsoft.com/office/word/2015/wordml/symex" xmlns:wpg="http://schemas.microsoft.com/office/word/2010/wordprocessingGroup" xmlns:wpi="http://schemas.microsoft.com/office/word/2010/wordprocessingInk" xmlns:wne="http://schemas.microsoft.com/office/word/2006/wordml" xmlns:wps="http://schemas.microsoft.com/office/word/2010/wordprocessingShape" mc:Ignorable="w14 w15 w16se w16cid w16 w16cex w16sdtdh w16sdtfl w16du wp14">
+<w:document xmlns:wpc="http://schemas.microsoft.com/office/word/2010/wordprocessingCanvas" xmlns:cx="http://schemas.microsoft.com/office/drawing/2014/chartex" xmlns:mc="http://schemas.openxmlformats.org/markup-compatibility/2006" xmlns:o="urn:schemas-microsoft-com:office:office" xmlns:r="http://schemas.openxmlformats.org/officeDocument/2006/relationships" xmlns:m="http://schemas.openxmlformats.org/officeDocument/2006/math" xmlns:v="urn:schemas-microsoft-com:vml" xmlns:wp14="http://schemas.microsoft.com/office/word/2010/wordprocessingDrawing" xmlns:wp="http://schemas.openxmlformats.org/drawingml/2006/wordprocessingDrawing" xmlns:w10="urn:schemas-microsoft-com:office:word" xmlns:w="http://schemas.openxmlformats.org/wordprocessingml/2006/main" xmlns:w14="http://schemas.microsoft.com/office/word/2010/wordml" xmlns:w15="http://schemas.microsoft.com/office/word/2012/wordml" xmlns:w16se="http://schemas.microsoft.com/office/word/2015/wordml/symex" xmlns:wpg="http://schemas.microsoft.com/office/word/2010/wordprocessingGroup" xmlns:wpi="http://schemas.microsoft.com/office/word/2010/wordprocessingInk" xmlns:wne="http://schemas.microsoft.com/office/word/2006/wordml" xmlns:wps="http://schemas.microsoft.com/office/word/2010/wordprocessingShape" mc:Ignorable="w14 w15 w16se wp14">
   <w:body>
     <w:p>
       <w:pPr>
@@ -78,7 +78,6 @@
           <w:rFonts w:ascii="Times New Roman" w:hAnsi="Times New Roman" w:cs="Times New Roman"/>
           <w:sz w:val="28"/>
           <w:szCs w:val="28"/>
-          <w:lang w:val="en-US"/>
         </w:rPr>
       </w:pPr>
       <w:r>
@@ -97,7 +96,6 @@
           <w:rFonts w:ascii="Times New Roman" w:hAnsi="Times New Roman" w:cs="Times New Roman"/>
           <w:sz w:val="28"/>
           <w:szCs w:val="28"/>
-          <w:lang w:val="en-US"/>
         </w:rPr>
       </w:pPr>
       <w:r>
@@ -478,15 +476,7 @@
           <w:sz w:val="28"/>
           <w:szCs w:val="28"/>
         </w:rPr>
-        <w:t>осведомленность</w:t>
-      </w:r>
-      <w:r>
-        <w:rPr>
-          <w:rFonts w:ascii="Times New Roman" w:hAnsi="Times New Roman" w:cs="Times New Roman"/>
-          <w:sz w:val="28"/>
-          <w:szCs w:val="28"/>
-        </w:rPr>
-        <w:t>;</w:t>
+        <w:t>осведомленность;</w:t>
       </w:r>
     </w:p>
     <w:p>
@@ -586,15 +576,55 @@
           <w:szCs w:val="28"/>
         </w:rPr>
         <w:lastRenderedPageBreak/>
-        <w:t xml:space="preserve">Для программы складского учёта выбрана </w:t>
-      </w:r>
-      <w:r>
-        <w:rPr>
-          <w:rFonts w:ascii="Times New Roman" w:hAnsi="Times New Roman" w:cs="Times New Roman"/>
-          <w:sz w:val="28"/>
-          <w:szCs w:val="28"/>
-        </w:rPr>
-        <w:t>веб-платформа, так как она имеет кроссплатформенность и у неё есть централизованное обновление, но при этом она имеет минусы, которые достаточно легко решаются либо не особо мешают.</w:t>
+        <w:t>Для пр</w:t>
+      </w:r>
+      <w:r>
+        <w:rPr>
+          <w:rFonts w:ascii="Times New Roman" w:hAnsi="Times New Roman" w:cs="Times New Roman"/>
+          <w:sz w:val="28"/>
+          <w:szCs w:val="28"/>
+        </w:rPr>
+        <w:t>ограммы складского учёта выбраны</w:t>
+      </w:r>
+      <w:r>
+        <w:rPr>
+          <w:rFonts w:ascii="Times New Roman" w:hAnsi="Times New Roman" w:cs="Times New Roman"/>
+          <w:sz w:val="28"/>
+          <w:szCs w:val="28"/>
+        </w:rPr>
+        <w:t xml:space="preserve"> </w:t>
+      </w:r>
+      <w:r>
+        <w:rPr>
+          <w:rFonts w:ascii="Times New Roman" w:hAnsi="Times New Roman" w:cs="Times New Roman"/>
+          <w:sz w:val="28"/>
+          <w:szCs w:val="28"/>
+        </w:rPr>
+        <w:t>веб-платформа</w:t>
+      </w:r>
+      <w:r>
+        <w:rPr>
+          <w:rFonts w:ascii="Times New Roman" w:hAnsi="Times New Roman" w:cs="Times New Roman"/>
+          <w:sz w:val="28"/>
+          <w:szCs w:val="28"/>
+        </w:rPr>
+        <w:t xml:space="preserve"> и настольное приложение</w:t>
+      </w:r>
+      <w:r>
+        <w:rPr>
+          <w:rFonts w:ascii="Times New Roman" w:hAnsi="Times New Roman" w:cs="Times New Roman"/>
+          <w:sz w:val="28"/>
+          <w:szCs w:val="28"/>
+        </w:rPr>
+        <w:t xml:space="preserve">, </w:t>
+      </w:r>
+      <w:r>
+        <w:rPr>
+          <w:rFonts w:ascii="Times New Roman" w:hAnsi="Times New Roman" w:cs="Times New Roman"/>
+          <w:sz w:val="28"/>
+          <w:szCs w:val="28"/>
+        </w:rPr>
+        <w:t>так как они самые производительные, кроссплатформенные и удобные, хоть и со своими минусами.</w:t>
       </w:r>
     </w:p>
     <w:p>
@@ -631,13 +661,15 @@
       </w:pPr>
       <w:r>
         <w:rPr>
-          <w:noProof/>
+          <w:rFonts w:ascii="Times New Roman" w:hAnsi="Times New Roman" w:cs="Times New Roman"/>
+          <w:sz w:val="28"/>
+          <w:szCs w:val="28"/>
         </w:rPr>
         <w:drawing>
-          <wp:inline distT="0" distB="0" distL="0" distR="0" wp14:anchorId="57D11B39" wp14:editId="1B268E1E">
-            <wp:extent cx="4498848" cy="2118859"/>
-            <wp:effectExtent l="0" t="0" r="0" b="0"/>
-            <wp:docPr id="1508047933" name="Рисунок 1"/>
+          <wp:inline distT="0" distB="0" distL="0" distR="0" wp14:anchorId="3D06AD67" wp14:editId="07704F22">
+            <wp:extent cx="5940425" cy="2748915"/>
+            <wp:effectExtent l="0" t="0" r="3175" b="0"/>
+            <wp:docPr id="1" name="Рисунок 1"/>
             <wp:cNvGraphicFramePr>
               <a:graphicFrameLocks xmlns:a="http://schemas.openxmlformats.org/drawingml/2006/main" noChangeAspect="1"/>
             </wp:cNvGraphicFramePr>
@@ -645,11 +677,11 @@
               <a:graphicData uri="http://schemas.openxmlformats.org/drawingml/2006/picture">
                 <pic:pic xmlns:pic="http://schemas.openxmlformats.org/drawingml/2006/picture">
                   <pic:nvPicPr>
-                    <pic:cNvPr id="1508047933" name=""/>
+                    <pic:cNvPr id="1" name=""/>
                     <pic:cNvPicPr/>
                   </pic:nvPicPr>
                   <pic:blipFill>
-                    <a:blip r:embed="rId5"/>
+                    <a:blip r:embed="rId6"/>
                     <a:stretch>
                       <a:fillRect/>
                     </a:stretch>
@@ -657,7 +689,7 @@
                   <pic:spPr>
                     <a:xfrm>
                       <a:off x="0" y="0"/>
-                      <a:ext cx="4508443" cy="2123378"/>
+                      <a:ext cx="5940425" cy="2748915"/>
                     </a:xfrm>
                     <a:prstGeom prst="rect">
                       <a:avLst/>
@@ -691,6 +723,673 @@
     </w:p>
     <w:p>
       <w:pPr>
+        <w:spacing w:line="360" w:lineRule="auto"/>
+        <w:rPr>
+          <w:rFonts w:ascii="Times New Roman" w:hAnsi="Times New Roman" w:cs="Times New Roman"/>
+          <w:b/>
+          <w:sz w:val="32"/>
+          <w:szCs w:val="32"/>
+        </w:rPr>
+      </w:pPr>
+      <w:r>
+        <w:rPr>
+          <w:rFonts w:ascii="Times New Roman" w:hAnsi="Times New Roman" w:cs="Times New Roman"/>
+          <w:b/>
+          <w:sz w:val="32"/>
+          <w:szCs w:val="32"/>
+        </w:rPr>
+        <w:t>Шаг 4</w:t>
+      </w:r>
+      <w:r>
+        <w:rPr>
+          <w:rFonts w:ascii="Times New Roman" w:hAnsi="Times New Roman" w:cs="Times New Roman"/>
+          <w:b/>
+          <w:sz w:val="32"/>
+          <w:szCs w:val="32"/>
+        </w:rPr>
+        <w:t>. Описание компонентов</w:t>
+      </w:r>
+    </w:p>
+    <w:p>
+      <w:pPr>
+        <w:spacing w:line="360" w:lineRule="auto"/>
+        <w:ind w:firstLine="709"/>
+        <w:rPr>
+          <w:rFonts w:ascii="Times New Roman" w:hAnsi="Times New Roman" w:cs="Times New Roman"/>
+          <w:sz w:val="28"/>
+          <w:szCs w:val="28"/>
+        </w:rPr>
+      </w:pPr>
+      <w:r>
+        <w:rPr>
+          <w:rFonts w:ascii="Times New Roman" w:hAnsi="Times New Roman" w:cs="Times New Roman"/>
+          <w:sz w:val="28"/>
+          <w:szCs w:val="28"/>
+        </w:rPr>
+        <w:t>Для</w:t>
+      </w:r>
+      <w:r>
+        <w:rPr>
+          <w:rFonts w:ascii="Times New Roman" w:hAnsi="Times New Roman" w:cs="Times New Roman"/>
+          <w:sz w:val="28"/>
+          <w:szCs w:val="28"/>
+        </w:rPr>
+        <w:t xml:space="preserve"> разработки </w:t>
+      </w:r>
+      <w:r>
+        <w:rPr>
+          <w:rFonts w:ascii="Times New Roman" w:hAnsi="Times New Roman" w:cs="Times New Roman"/>
+          <w:sz w:val="28"/>
+          <w:szCs w:val="28"/>
+        </w:rPr>
+        <w:t xml:space="preserve">мы используем такие компоненты, как: </w:t>
+      </w:r>
+      <w:r>
+        <w:rPr>
+          <w:rFonts w:ascii="Times New Roman" w:hAnsi="Times New Roman" w:cs="Times New Roman"/>
+          <w:sz w:val="28"/>
+          <w:szCs w:val="28"/>
+          <w:lang w:val="en-US"/>
+        </w:rPr>
+        <w:t>Django</w:t>
+      </w:r>
+      <w:r>
+        <w:rPr>
+          <w:rFonts w:ascii="Times New Roman" w:hAnsi="Times New Roman" w:cs="Times New Roman"/>
+          <w:sz w:val="28"/>
+          <w:szCs w:val="28"/>
+        </w:rPr>
+        <w:t xml:space="preserve">, </w:t>
+      </w:r>
+      <w:proofErr w:type="spellStart"/>
+      <w:r>
+        <w:rPr>
+          <w:rFonts w:ascii="Times New Roman" w:hAnsi="Times New Roman" w:cs="Times New Roman"/>
+          <w:sz w:val="28"/>
+          <w:szCs w:val="28"/>
+          <w:lang w:val="en-US"/>
+        </w:rPr>
+        <w:t>FastAPI</w:t>
+      </w:r>
+      <w:proofErr w:type="spellEnd"/>
+      <w:r>
+        <w:rPr>
+          <w:rFonts w:ascii="Times New Roman" w:hAnsi="Times New Roman" w:cs="Times New Roman"/>
+          <w:sz w:val="28"/>
+          <w:szCs w:val="28"/>
+        </w:rPr>
+        <w:t xml:space="preserve">, </w:t>
+      </w:r>
+      <w:proofErr w:type="spellStart"/>
+      <w:r>
+        <w:rPr>
+          <w:rFonts w:ascii="Times New Roman" w:hAnsi="Times New Roman" w:cs="Times New Roman"/>
+          <w:sz w:val="28"/>
+          <w:szCs w:val="28"/>
+          <w:lang w:val="en-US"/>
+        </w:rPr>
+        <w:t>SQLAlchemy</w:t>
+      </w:r>
+      <w:proofErr w:type="spellEnd"/>
+      <w:r>
+        <w:rPr>
+          <w:rFonts w:ascii="Times New Roman" w:hAnsi="Times New Roman" w:cs="Times New Roman"/>
+          <w:sz w:val="28"/>
+          <w:szCs w:val="28"/>
+        </w:rPr>
+        <w:t xml:space="preserve">, </w:t>
+      </w:r>
+      <w:proofErr w:type="spellStart"/>
+      <w:r>
+        <w:rPr>
+          <w:rFonts w:ascii="Times New Roman" w:hAnsi="Times New Roman" w:cs="Times New Roman"/>
+          <w:sz w:val="28"/>
+          <w:szCs w:val="28"/>
+          <w:lang w:val="en-US"/>
+        </w:rPr>
+        <w:t>Streamlit</w:t>
+      </w:r>
+      <w:proofErr w:type="spellEnd"/>
+      <w:r>
+        <w:rPr>
+          <w:rFonts w:ascii="Times New Roman" w:hAnsi="Times New Roman" w:cs="Times New Roman"/>
+          <w:sz w:val="28"/>
+          <w:szCs w:val="28"/>
+        </w:rPr>
+        <w:t xml:space="preserve"> и </w:t>
+      </w:r>
+      <w:r>
+        <w:rPr>
+          <w:rFonts w:ascii="Times New Roman" w:hAnsi="Times New Roman" w:cs="Times New Roman"/>
+          <w:sz w:val="28"/>
+          <w:szCs w:val="28"/>
+          <w:lang w:val="en-US"/>
+        </w:rPr>
+        <w:t>pandas</w:t>
+      </w:r>
+      <w:r>
+        <w:rPr>
+          <w:rFonts w:ascii="Times New Roman" w:hAnsi="Times New Roman" w:cs="Times New Roman"/>
+          <w:sz w:val="28"/>
+          <w:szCs w:val="28"/>
+        </w:rPr>
+        <w:t>.</w:t>
+      </w:r>
+    </w:p>
+    <w:p>
+      <w:pPr>
+        <w:spacing w:line="360" w:lineRule="auto"/>
+        <w:ind w:firstLine="709"/>
+        <w:rPr>
+          <w:rFonts w:ascii="Times New Roman" w:hAnsi="Times New Roman" w:cs="Times New Roman"/>
+          <w:sz w:val="28"/>
+          <w:szCs w:val="28"/>
+        </w:rPr>
+      </w:pPr>
+      <w:r>
+        <w:rPr>
+          <w:rFonts w:ascii="Times New Roman" w:hAnsi="Times New Roman" w:cs="Times New Roman"/>
+          <w:sz w:val="28"/>
+          <w:szCs w:val="28"/>
+          <w:lang w:val="en-US"/>
+        </w:rPr>
+        <w:t>Django</w:t>
+      </w:r>
+      <w:r>
+        <w:rPr>
+          <w:rFonts w:ascii="Times New Roman" w:hAnsi="Times New Roman" w:cs="Times New Roman"/>
+          <w:sz w:val="28"/>
+          <w:szCs w:val="28"/>
+        </w:rPr>
+        <w:t xml:space="preserve"> </w:t>
+      </w:r>
+      <w:r>
+        <w:rPr>
+          <w:rFonts w:ascii="Times New Roman" w:hAnsi="Times New Roman" w:cs="Times New Roman"/>
+          <w:sz w:val="28"/>
+          <w:szCs w:val="28"/>
+        </w:rPr>
+        <w:t xml:space="preserve">– это основной «каркас» для </w:t>
+      </w:r>
+      <w:proofErr w:type="spellStart"/>
+      <w:r>
+        <w:rPr>
+          <w:rFonts w:ascii="Times New Roman" w:hAnsi="Times New Roman" w:cs="Times New Roman"/>
+          <w:sz w:val="28"/>
+          <w:szCs w:val="28"/>
+        </w:rPr>
+        <w:t>бэкенда</w:t>
+      </w:r>
+      <w:proofErr w:type="spellEnd"/>
+      <w:r>
+        <w:rPr>
+          <w:rFonts w:ascii="Times New Roman" w:hAnsi="Times New Roman" w:cs="Times New Roman"/>
+          <w:sz w:val="28"/>
+          <w:szCs w:val="28"/>
+        </w:rPr>
+        <w:t xml:space="preserve">. Требуется для встроенной админ-панель, </w:t>
+      </w:r>
+      <w:r>
+        <w:rPr>
+          <w:rFonts w:ascii="Times New Roman" w:hAnsi="Times New Roman" w:cs="Times New Roman"/>
+          <w:sz w:val="28"/>
+          <w:szCs w:val="28"/>
+          <w:lang w:val="en-US"/>
+        </w:rPr>
+        <w:t>ORM</w:t>
+      </w:r>
+      <w:r>
+        <w:rPr>
+          <w:rFonts w:ascii="Times New Roman" w:hAnsi="Times New Roman" w:cs="Times New Roman"/>
+          <w:sz w:val="28"/>
+          <w:szCs w:val="28"/>
+        </w:rPr>
+        <w:t xml:space="preserve"> </w:t>
+      </w:r>
+      <w:r>
+        <w:rPr>
+          <w:rFonts w:ascii="Times New Roman" w:hAnsi="Times New Roman" w:cs="Times New Roman"/>
+          <w:sz w:val="28"/>
+          <w:szCs w:val="28"/>
+        </w:rPr>
+        <w:t>и системы защиты.</w:t>
+      </w:r>
+      <w:r>
+        <w:rPr>
+          <w:rFonts w:ascii="Times New Roman" w:hAnsi="Times New Roman" w:cs="Times New Roman"/>
+          <w:sz w:val="28"/>
+          <w:szCs w:val="28"/>
+        </w:rPr>
+        <w:t xml:space="preserve"> Он будет использоваться в системе маршрутизации, складского учёта и системы поддержки пользователей.</w:t>
+      </w:r>
+    </w:p>
+    <w:p>
+      <w:pPr>
+        <w:spacing w:line="360" w:lineRule="auto"/>
+        <w:ind w:firstLine="709"/>
+        <w:rPr>
+          <w:rFonts w:ascii="Times New Roman" w:hAnsi="Times New Roman" w:cs="Times New Roman"/>
+          <w:sz w:val="28"/>
+          <w:szCs w:val="28"/>
+        </w:rPr>
+      </w:pPr>
+      <w:proofErr w:type="spellStart"/>
+      <w:r>
+        <w:rPr>
+          <w:rFonts w:ascii="Times New Roman" w:hAnsi="Times New Roman" w:cs="Times New Roman"/>
+          <w:sz w:val="28"/>
+          <w:szCs w:val="28"/>
+          <w:lang w:val="en-US"/>
+        </w:rPr>
+        <w:t>FastAPI</w:t>
+      </w:r>
+      <w:proofErr w:type="spellEnd"/>
+      <w:r>
+        <w:rPr>
+          <w:rFonts w:ascii="Times New Roman" w:hAnsi="Times New Roman" w:cs="Times New Roman"/>
+          <w:sz w:val="28"/>
+          <w:szCs w:val="28"/>
+        </w:rPr>
+        <w:t xml:space="preserve"> </w:t>
+      </w:r>
+      <w:r>
+        <w:rPr>
+          <w:rFonts w:ascii="Times New Roman" w:hAnsi="Times New Roman" w:cs="Times New Roman"/>
+          <w:sz w:val="28"/>
+          <w:szCs w:val="28"/>
+        </w:rPr>
+        <w:t xml:space="preserve">требуется для создания </w:t>
+      </w:r>
+      <w:r>
+        <w:rPr>
+          <w:rFonts w:ascii="Times New Roman" w:hAnsi="Times New Roman" w:cs="Times New Roman"/>
+          <w:sz w:val="28"/>
+          <w:szCs w:val="28"/>
+          <w:lang w:val="en-US"/>
+        </w:rPr>
+        <w:t>REST</w:t>
+      </w:r>
+      <w:r>
+        <w:rPr>
+          <w:rFonts w:ascii="Times New Roman" w:hAnsi="Times New Roman" w:cs="Times New Roman"/>
+          <w:sz w:val="28"/>
+          <w:szCs w:val="28"/>
+        </w:rPr>
+        <w:t xml:space="preserve"> </w:t>
+      </w:r>
+      <w:r>
+        <w:rPr>
+          <w:rFonts w:ascii="Times New Roman" w:hAnsi="Times New Roman" w:cs="Times New Roman"/>
+          <w:sz w:val="28"/>
+          <w:szCs w:val="28"/>
+          <w:lang w:val="en-US"/>
+        </w:rPr>
+        <w:t>API</w:t>
+      </w:r>
+      <w:r>
+        <w:rPr>
+          <w:rFonts w:ascii="Times New Roman" w:hAnsi="Times New Roman" w:cs="Times New Roman"/>
+          <w:sz w:val="28"/>
+          <w:szCs w:val="28"/>
+        </w:rPr>
+        <w:t xml:space="preserve"> </w:t>
+      </w:r>
+      <w:r>
+        <w:rPr>
+          <w:rFonts w:ascii="Times New Roman" w:hAnsi="Times New Roman" w:cs="Times New Roman"/>
+          <w:sz w:val="28"/>
+          <w:szCs w:val="28"/>
+        </w:rPr>
+        <w:t xml:space="preserve">и </w:t>
+      </w:r>
+      <w:proofErr w:type="spellStart"/>
+      <w:r>
+        <w:rPr>
+          <w:rFonts w:ascii="Times New Roman" w:hAnsi="Times New Roman" w:cs="Times New Roman"/>
+          <w:sz w:val="28"/>
+          <w:szCs w:val="28"/>
+        </w:rPr>
+        <w:t>микросервисов</w:t>
+      </w:r>
+      <w:proofErr w:type="spellEnd"/>
+      <w:r>
+        <w:rPr>
+          <w:rFonts w:ascii="Times New Roman" w:hAnsi="Times New Roman" w:cs="Times New Roman"/>
+          <w:sz w:val="28"/>
+          <w:szCs w:val="28"/>
+        </w:rPr>
+        <w:t xml:space="preserve">. Также, имеет автоматическую документацию. </w:t>
+      </w:r>
+      <w:r>
+        <w:rPr>
+          <w:rFonts w:ascii="Times New Roman" w:hAnsi="Times New Roman" w:cs="Times New Roman"/>
+          <w:sz w:val="28"/>
+          <w:szCs w:val="28"/>
+        </w:rPr>
+        <w:t>Он будет использоваться в системе отчётов, складского учёта и системы поддержки пользователей.</w:t>
+      </w:r>
+    </w:p>
+    <w:p>
+      <w:pPr>
+        <w:spacing w:line="360" w:lineRule="auto"/>
+        <w:ind w:firstLine="709"/>
+        <w:rPr>
+          <w:rFonts w:ascii="Times New Roman" w:hAnsi="Times New Roman" w:cs="Times New Roman"/>
+          <w:sz w:val="28"/>
+          <w:szCs w:val="28"/>
+        </w:rPr>
+      </w:pPr>
+      <w:r>
+        <w:rPr>
+          <w:rFonts w:ascii="Times New Roman" w:hAnsi="Times New Roman" w:cs="Times New Roman"/>
+          <w:sz w:val="28"/>
+          <w:szCs w:val="28"/>
+          <w:lang w:val="en-US"/>
+        </w:rPr>
+        <w:t>Pandas</w:t>
+      </w:r>
+      <w:r>
+        <w:rPr>
+          <w:rFonts w:ascii="Times New Roman" w:hAnsi="Times New Roman" w:cs="Times New Roman"/>
+          <w:sz w:val="28"/>
+          <w:szCs w:val="28"/>
+        </w:rPr>
+        <w:t xml:space="preserve"> </w:t>
+      </w:r>
+      <w:r>
+        <w:rPr>
+          <w:rFonts w:ascii="Times New Roman" w:hAnsi="Times New Roman" w:cs="Times New Roman"/>
+          <w:sz w:val="28"/>
+          <w:szCs w:val="28"/>
+        </w:rPr>
+        <w:t>требуется для работы с таблицами.</w:t>
+      </w:r>
+      <w:r>
+        <w:rPr>
+          <w:rFonts w:ascii="Times New Roman" w:hAnsi="Times New Roman" w:cs="Times New Roman"/>
+          <w:sz w:val="28"/>
+          <w:szCs w:val="28"/>
+        </w:rPr>
+        <w:t xml:space="preserve"> Он будет использоваться в системе отчётов. </w:t>
+      </w:r>
+    </w:p>
+    <w:p>
+      <w:pPr>
+        <w:spacing w:line="360" w:lineRule="auto"/>
+        <w:ind w:firstLine="709"/>
+        <w:rPr>
+          <w:rFonts w:ascii="Times New Roman" w:hAnsi="Times New Roman" w:cs="Times New Roman"/>
+          <w:sz w:val="28"/>
+          <w:szCs w:val="28"/>
+        </w:rPr>
+      </w:pPr>
+      <w:proofErr w:type="spellStart"/>
+      <w:r>
+        <w:rPr>
+          <w:rFonts w:ascii="Times New Roman" w:hAnsi="Times New Roman" w:cs="Times New Roman"/>
+          <w:sz w:val="28"/>
+          <w:szCs w:val="28"/>
+          <w:lang w:val="en-US"/>
+        </w:rPr>
+        <w:lastRenderedPageBreak/>
+        <w:t>Streamlit</w:t>
+      </w:r>
+      <w:proofErr w:type="spellEnd"/>
+      <w:r>
+        <w:rPr>
+          <w:rFonts w:ascii="Times New Roman" w:hAnsi="Times New Roman" w:cs="Times New Roman"/>
+          <w:sz w:val="28"/>
+          <w:szCs w:val="28"/>
+        </w:rPr>
+        <w:t xml:space="preserve"> </w:t>
+      </w:r>
+      <w:r>
+        <w:rPr>
+          <w:rFonts w:ascii="Times New Roman" w:hAnsi="Times New Roman" w:cs="Times New Roman"/>
+          <w:sz w:val="28"/>
+          <w:szCs w:val="28"/>
+        </w:rPr>
+        <w:t xml:space="preserve">требуется для </w:t>
+      </w:r>
+      <w:r>
+        <w:rPr>
+          <w:rFonts w:ascii="Times New Roman" w:hAnsi="Times New Roman" w:cs="Times New Roman"/>
+          <w:sz w:val="28"/>
+          <w:szCs w:val="28"/>
+        </w:rPr>
+        <w:t>быстрого создания внутренних инструментов: простые отчёты, веб-интерфейсы, панелей аналитики</w:t>
+      </w:r>
+      <w:r>
+        <w:rPr>
+          <w:rFonts w:ascii="Times New Roman" w:hAnsi="Times New Roman" w:cs="Times New Roman"/>
+          <w:sz w:val="28"/>
+          <w:szCs w:val="28"/>
+        </w:rPr>
+        <w:t>.</w:t>
+      </w:r>
+      <w:r>
+        <w:rPr>
+          <w:rFonts w:ascii="Times New Roman" w:hAnsi="Times New Roman" w:cs="Times New Roman"/>
+          <w:sz w:val="28"/>
+          <w:szCs w:val="28"/>
+        </w:rPr>
+        <w:t xml:space="preserve"> Он будет использоваться в системе складского учёта и системе отчётов.</w:t>
+      </w:r>
+    </w:p>
+    <w:p>
+      <w:pPr>
+        <w:spacing w:line="360" w:lineRule="auto"/>
+        <w:ind w:firstLine="709"/>
+        <w:rPr>
+          <w:rFonts w:ascii="Times New Roman" w:hAnsi="Times New Roman" w:cs="Times New Roman"/>
+          <w:sz w:val="28"/>
+          <w:szCs w:val="28"/>
+        </w:rPr>
+      </w:pPr>
+      <w:r>
+        <w:rPr>
+          <w:rFonts w:ascii="Times New Roman" w:hAnsi="Times New Roman" w:cs="Times New Roman"/>
+          <w:sz w:val="28"/>
+          <w:szCs w:val="28"/>
+        </w:rPr>
+        <w:t>Для хранения данных мы используем такие компоненты, как:</w:t>
+      </w:r>
+      <w:r>
+        <w:rPr>
+          <w:rFonts w:ascii="Times New Roman" w:hAnsi="Times New Roman" w:cs="Times New Roman"/>
+          <w:sz w:val="28"/>
+          <w:szCs w:val="28"/>
+        </w:rPr>
+        <w:t xml:space="preserve"> </w:t>
+      </w:r>
+      <w:r>
+        <w:rPr>
+          <w:rFonts w:ascii="Times New Roman" w:hAnsi="Times New Roman" w:cs="Times New Roman"/>
+          <w:sz w:val="28"/>
+          <w:szCs w:val="28"/>
+          <w:lang w:val="en-US"/>
+        </w:rPr>
+        <w:t>PostgreSQL</w:t>
+      </w:r>
+      <w:r>
+        <w:rPr>
+          <w:rFonts w:ascii="Times New Roman" w:hAnsi="Times New Roman" w:cs="Times New Roman"/>
+          <w:sz w:val="28"/>
+          <w:szCs w:val="28"/>
+        </w:rPr>
+        <w:t xml:space="preserve"> </w:t>
+      </w:r>
+      <w:r>
+        <w:rPr>
+          <w:rFonts w:ascii="Times New Roman" w:hAnsi="Times New Roman" w:cs="Times New Roman"/>
+          <w:sz w:val="28"/>
+          <w:szCs w:val="28"/>
+        </w:rPr>
+        <w:t xml:space="preserve">и </w:t>
+      </w:r>
+      <w:proofErr w:type="spellStart"/>
+      <w:r>
+        <w:rPr>
+          <w:rFonts w:ascii="Times New Roman" w:hAnsi="Times New Roman" w:cs="Times New Roman"/>
+          <w:sz w:val="28"/>
+          <w:szCs w:val="28"/>
+          <w:lang w:val="en-US"/>
+        </w:rPr>
+        <w:t>redis</w:t>
+      </w:r>
+      <w:proofErr w:type="spellEnd"/>
+      <w:r>
+        <w:rPr>
+          <w:rFonts w:ascii="Times New Roman" w:hAnsi="Times New Roman" w:cs="Times New Roman"/>
+          <w:sz w:val="28"/>
+          <w:szCs w:val="28"/>
+        </w:rPr>
+        <w:t>.</w:t>
+      </w:r>
+    </w:p>
+    <w:p>
+      <w:pPr>
+        <w:spacing w:line="360" w:lineRule="auto"/>
+        <w:ind w:firstLine="709"/>
+        <w:rPr>
+          <w:rFonts w:ascii="Times New Roman" w:hAnsi="Times New Roman" w:cs="Times New Roman"/>
+          <w:sz w:val="28"/>
+          <w:szCs w:val="28"/>
+        </w:rPr>
+      </w:pPr>
+      <w:r>
+        <w:rPr>
+          <w:rFonts w:ascii="Times New Roman" w:hAnsi="Times New Roman" w:cs="Times New Roman"/>
+          <w:sz w:val="28"/>
+          <w:szCs w:val="28"/>
+          <w:lang w:val="en-US"/>
+        </w:rPr>
+        <w:t>PostgreSQL</w:t>
+      </w:r>
+      <w:r>
+        <w:rPr>
+          <w:rFonts w:ascii="Times New Roman" w:hAnsi="Times New Roman" w:cs="Times New Roman"/>
+          <w:sz w:val="28"/>
+          <w:szCs w:val="28"/>
+        </w:rPr>
+        <w:t xml:space="preserve"> </w:t>
+      </w:r>
+      <w:r>
+        <w:rPr>
+          <w:rFonts w:ascii="Times New Roman" w:hAnsi="Times New Roman" w:cs="Times New Roman"/>
+          <w:sz w:val="28"/>
+          <w:szCs w:val="28"/>
+        </w:rPr>
+        <w:t>требуется для основного хранилища данных.</w:t>
+      </w:r>
+      <w:r>
+        <w:rPr>
+          <w:rFonts w:ascii="Times New Roman" w:hAnsi="Times New Roman" w:cs="Times New Roman"/>
+          <w:sz w:val="28"/>
+          <w:szCs w:val="28"/>
+        </w:rPr>
+        <w:t xml:space="preserve"> Он будет использоваться для системы уведомлений, системы поддержки пользователей</w:t>
+      </w:r>
+      <w:r>
+        <w:rPr>
+          <w:rFonts w:ascii="Times New Roman" w:hAnsi="Times New Roman" w:cs="Times New Roman"/>
+          <w:sz w:val="28"/>
+          <w:szCs w:val="28"/>
+        </w:rPr>
+        <w:t xml:space="preserve"> и системе складского учёта.</w:t>
+      </w:r>
+      <w:r>
+        <w:rPr>
+          <w:rFonts w:ascii="Times New Roman" w:hAnsi="Times New Roman" w:cs="Times New Roman"/>
+          <w:sz w:val="28"/>
+          <w:szCs w:val="28"/>
+        </w:rPr>
+        <w:t xml:space="preserve"> </w:t>
+      </w:r>
+    </w:p>
+    <w:p>
+      <w:pPr>
+        <w:spacing w:line="360" w:lineRule="auto"/>
+        <w:ind w:firstLine="709"/>
+        <w:rPr>
+          <w:rFonts w:ascii="Times New Roman" w:hAnsi="Times New Roman" w:cs="Times New Roman"/>
+          <w:sz w:val="28"/>
+          <w:szCs w:val="28"/>
+        </w:rPr>
+      </w:pPr>
+      <w:proofErr w:type="spellStart"/>
+      <w:r>
+        <w:rPr>
+          <w:rFonts w:ascii="Times New Roman" w:hAnsi="Times New Roman" w:cs="Times New Roman"/>
+          <w:sz w:val="28"/>
+          <w:szCs w:val="28"/>
+          <w:lang w:val="en-US"/>
+        </w:rPr>
+        <w:t>Redis</w:t>
+      </w:r>
+      <w:proofErr w:type="spellEnd"/>
+      <w:r>
+        <w:rPr>
+          <w:rFonts w:ascii="Times New Roman" w:hAnsi="Times New Roman" w:cs="Times New Roman"/>
+          <w:sz w:val="28"/>
+          <w:szCs w:val="28"/>
+        </w:rPr>
+        <w:t xml:space="preserve"> </w:t>
+      </w:r>
+      <w:r>
+        <w:rPr>
+          <w:rFonts w:ascii="Times New Roman" w:hAnsi="Times New Roman" w:cs="Times New Roman"/>
+          <w:sz w:val="28"/>
+          <w:szCs w:val="28"/>
+        </w:rPr>
+        <w:t xml:space="preserve">требуется для кэширования, чтобы не нагружать </w:t>
+      </w:r>
+      <w:r>
+        <w:rPr>
+          <w:rFonts w:ascii="Times New Roman" w:hAnsi="Times New Roman" w:cs="Times New Roman"/>
+          <w:sz w:val="28"/>
+          <w:szCs w:val="28"/>
+          <w:lang w:val="en-US"/>
+        </w:rPr>
+        <w:t>PostgreSQL</w:t>
+      </w:r>
+      <w:r>
+        <w:rPr>
+          <w:rFonts w:ascii="Times New Roman" w:hAnsi="Times New Roman" w:cs="Times New Roman"/>
+          <w:sz w:val="28"/>
+          <w:szCs w:val="28"/>
+        </w:rPr>
+        <w:t xml:space="preserve"> </w:t>
+      </w:r>
+      <w:r>
+        <w:rPr>
+          <w:rFonts w:ascii="Times New Roman" w:hAnsi="Times New Roman" w:cs="Times New Roman"/>
+          <w:sz w:val="28"/>
+          <w:szCs w:val="28"/>
+        </w:rPr>
+        <w:t xml:space="preserve">частыми запросами. </w:t>
+      </w:r>
+      <w:r>
+        <w:rPr>
+          <w:rFonts w:ascii="Times New Roman" w:hAnsi="Times New Roman" w:cs="Times New Roman"/>
+          <w:sz w:val="28"/>
+          <w:szCs w:val="28"/>
+        </w:rPr>
+        <w:t>Он будет использоваться в системе складского учёта и системе поддержки пользователей.</w:t>
+      </w:r>
+      <w:bookmarkStart w:id="0" w:name="_GoBack"/>
+      <w:bookmarkEnd w:id="0"/>
+      <w:r>
+        <w:rPr>
+          <w:rFonts w:ascii="Times New Roman" w:hAnsi="Times New Roman" w:cs="Times New Roman"/>
+          <w:sz w:val="28"/>
+          <w:szCs w:val="28"/>
+        </w:rPr>
+        <w:t xml:space="preserve"> </w:t>
+      </w:r>
+    </w:p>
+    <w:p>
+      <w:pPr>
         <w:rPr>
           <w:rFonts w:ascii="Times New Roman" w:hAnsi="Times New Roman" w:cs="Times New Roman"/>
           <w:b/>
@@ -707,7 +1406,17 @@
           <w:sz w:val="32"/>
           <w:szCs w:val="32"/>
         </w:rPr>
-        <w:t>Шаг 4. Оценка сроков выполнения работ</w:t>
+        <w:t>Шаг 5</w:t>
+      </w:r>
+      <w:r>
+        <w:rPr>
+          <w:rFonts w:ascii="Times New Roman" w:hAnsi="Times New Roman" w:cs="Times New Roman"/>
+          <w:b/>
+          <w:bCs/>
+          <w:sz w:val="32"/>
+          <w:szCs w:val="32"/>
+        </w:rPr>
+        <w:t>. Оценка сроков выполнения работ</w:t>
       </w:r>
     </w:p>
     <w:p>
@@ -883,7 +1592,7 @@
 </file>
 
 <file path=word/numbering.xml><?xml version="1.0" encoding="utf-8"?>
-<w:numbering xmlns:wpc="http://schemas.microsoft.com/office/word/2010/wordprocessingCanvas" xmlns:cx="http://schemas.microsoft.com/office/drawing/2014/chartex" xmlns:cx1="http://schemas.microsoft.com/office/drawing/2015/9/8/chartex" xmlns:cx2="http://schemas.microsoft.com/office/drawing/2015/10/21/chartex" xmlns:cx3="http://schemas.microsoft.com/office/drawing/2016/5/9/chartex" xmlns:cx4="http://schemas.microsoft.com/office/drawing/2016/5/10/chartex" xmlns:cx5="http://schemas.microsoft.com/office/drawing/2016/5/11/chartex" xmlns:cx6="http://schemas.microsoft.com/office/drawing/2016/5/12/chartex" xmlns:cx7="http://schemas.microsoft.com/office/drawing/2016/5/13/chartex" xmlns:cx8="http://schemas.microsoft.com/office/drawing/2016/5/14/chartex" xmlns:mc="http://schemas.openxmlformats.org/markup-compatibility/2006" xmlns:aink="http://schemas.microsoft.com/office/drawing/2016/ink" xmlns:am3d="http://schemas.microsoft.com/office/drawing/2017/model3d" xmlns:o="urn:schemas-microsoft-com:office:office" xmlns:oel="http://schemas.microsoft.com/office/2019/extlst" xmlns:r="http://schemas.openxmlformats.org/officeDocument/2006/relationships" xmlns:m="http://schemas.openxmlformats.org/officeDocument/2006/math" xmlns:v="urn:schemas-microsoft-com:vml" xmlns:wp14="http://schemas.microsoft.com/office/word/2010/wordprocessingDrawing" xmlns:wp="http://schemas.openxmlformats.org/drawingml/2006/wordprocessingDrawing" xmlns:w10="urn:schemas-microsoft-com:office:word" xmlns:w="http://schemas.openxmlformats.org/wordprocessingml/2006/main" xmlns:w14="http://schemas.microsoft.com/office/word/2010/wordml" xmlns:w15="http://schemas.microsoft.com/office/word/2012/wordml" xmlns:w16cex="http://schemas.microsoft.com/office/word/2018/wordml/cex" xmlns:w16cid="http://schemas.microsoft.com/office/word/2016/wordml/cid" xmlns:w16="http://schemas.microsoft.com/office/word/2018/wordml" xmlns:w16du="http://schemas.microsoft.com/office/word/2023/wordml/word16du" xmlns:w16sdtdh="http://schemas.microsoft.com/office/word/2020/wordml/sdtdatahash" xmlns:w16sdtfl="http://schemas.microsoft.com/office/word/2024/wordml/sdtformatlock" xmlns:w16se="http://schemas.microsoft.com/office/word/2015/wordml/symex" xmlns:wpg="http://schemas.microsoft.com/office/word/2010/wordprocessingGroup" xmlns:wpi="http://schemas.microsoft.com/office/word/2010/wordprocessingInk" xmlns:wne="http://schemas.microsoft.com/office/word/2006/wordml" xmlns:wps="http://schemas.microsoft.com/office/word/2010/wordprocessingShape" mc:Ignorable="w14 w15 w16se w16cid w16 w16cex w16sdtdh w16sdtfl w16du wp14">
+<w:numbering xmlns:wpc="http://schemas.microsoft.com/office/word/2010/wordprocessingCanvas" xmlns:cx="http://schemas.microsoft.com/office/drawing/2014/chartex" xmlns:mc="http://schemas.openxmlformats.org/markup-compatibility/2006" xmlns:o="urn:schemas-microsoft-com:office:office" xmlns:r="http://schemas.openxmlformats.org/officeDocument/2006/relationships" xmlns:m="http://schemas.openxmlformats.org/officeDocument/2006/math" xmlns:v="urn:schemas-microsoft-com:vml" xmlns:wp14="http://schemas.microsoft.com/office/word/2010/wordprocessingDrawing" xmlns:wp="http://schemas.openxmlformats.org/drawingml/2006/wordprocessingDrawing" xmlns:w10="urn:schemas-microsoft-com:office:word" xmlns:w="http://schemas.openxmlformats.org/wordprocessingml/2006/main" xmlns:w14="http://schemas.microsoft.com/office/word/2010/wordml" xmlns:w15="http://schemas.microsoft.com/office/word/2012/wordml" xmlns:w16se="http://schemas.microsoft.com/office/word/2015/wordml/symex" xmlns:wpg="http://schemas.microsoft.com/office/word/2010/wordprocessingGroup" xmlns:wpi="http://schemas.microsoft.com/office/word/2010/wordprocessingInk" xmlns:wne="http://schemas.microsoft.com/office/word/2006/wordml" xmlns:wps="http://schemas.microsoft.com/office/word/2010/wordprocessingShape" mc:Ignorable="w14 w15 w16se wp14">
   <w:abstractNum w:abstractNumId="0" w15:restartNumberingAfterBreak="0">
     <w:nsid w:val="06F063A1"/>
     <w:multiLevelType w:val="hybridMultilevel"/>
@@ -1661,38 +2370,38 @@
       </w:pPr>
     </w:lvl>
   </w:abstractNum>
-  <w:num w:numId="1" w16cid:durableId="92168820">
+  <w:num w:numId="1">
     <w:abstractNumId w:val="4"/>
   </w:num>
-  <w:num w:numId="2" w16cid:durableId="281771378">
+  <w:num w:numId="2">
     <w:abstractNumId w:val="6"/>
   </w:num>
-  <w:num w:numId="3" w16cid:durableId="203060772">
+  <w:num w:numId="3">
     <w:abstractNumId w:val="2"/>
   </w:num>
-  <w:num w:numId="4" w16cid:durableId="850605916">
+  <w:num w:numId="4">
     <w:abstractNumId w:val="8"/>
   </w:num>
-  <w:num w:numId="5" w16cid:durableId="2061978973">
+  <w:num w:numId="5">
     <w:abstractNumId w:val="3"/>
   </w:num>
-  <w:num w:numId="6" w16cid:durableId="640428891">
+  <w:num w:numId="6">
     <w:abstractNumId w:val="0"/>
   </w:num>
-  <w:num w:numId="7" w16cid:durableId="2145733864">
+  <w:num w:numId="7">
     <w:abstractNumId w:val="1"/>
   </w:num>
-  <w:num w:numId="8" w16cid:durableId="538785123">
+  <w:num w:numId="8">
     <w:abstractNumId w:val="5"/>
   </w:num>
-  <w:num w:numId="9" w16cid:durableId="1673677751">
+  <w:num w:numId="9">
     <w:abstractNumId w:val="7"/>
   </w:num>
 </w:numbering>
 </file>
 
 <file path=word/styles.xml><?xml version="1.0" encoding="utf-8"?>
-<w:styles xmlns:mc="http://schemas.openxmlformats.org/markup-compatibility/2006" xmlns:r="http://schemas.openxmlformats.org/officeDocument/2006/relationships" xmlns:w="http://schemas.openxmlformats.org/wordprocessingml/2006/main" xmlns:w14="http://schemas.microsoft.com/office/word/2010/wordml" xmlns:w15="http://schemas.microsoft.com/office/word/2012/wordml" xmlns:w16cex="http://schemas.microsoft.com/office/word/2018/wordml/cex" xmlns:w16cid="http://schemas.microsoft.com/office/word/2016/wordml/cid" xmlns:w16="http://schemas.microsoft.com/office/word/2018/wordml" xmlns:w16du="http://schemas.microsoft.com/office/word/2023/wordml/word16du" xmlns:w16sdtdh="http://schemas.microsoft.com/office/word/2020/wordml/sdtdatahash" xmlns:w16sdtfl="http://schemas.microsoft.com/office/word/2024/wordml/sdtformatlock" xmlns:w16se="http://schemas.microsoft.com/office/word/2015/wordml/symex" mc:Ignorable="w14 w15 w16se w16cid w16 w16cex w16sdtdh w16sdtfl w16du">
+<w:styles xmlns:mc="http://schemas.openxmlformats.org/markup-compatibility/2006" xmlns:r="http://schemas.openxmlformats.org/officeDocument/2006/relationships" xmlns:w="http://schemas.openxmlformats.org/wordprocessingml/2006/main" xmlns:w14="http://schemas.microsoft.com/office/word/2010/wordml" xmlns:w15="http://schemas.microsoft.com/office/word/2012/wordml" xmlns:w16se="http://schemas.microsoft.com/office/word/2015/wordml/symex" mc:Ignorable="w14 w15 w16se">
   <w:docDefaults>
     <w:rPrDefault>
       <w:rPr>
@@ -1710,7 +2419,7 @@
       </w:pPr>
     </w:pPrDefault>
   </w:docDefaults>
-  <w:latentStyles w:defLockedState="0" w:defUIPriority="99" w:defSemiHidden="0" w:defUnhideWhenUsed="0" w:defQFormat="0" w:count="376">
+  <w:latentStyles w:defLockedState="0" w:defUIPriority="99" w:defSemiHidden="0" w:defUnhideWhenUsed="0" w:defQFormat="0" w:count="371">
     <w:lsdException w:name="Normal" w:uiPriority="0" w:qFormat="1"/>
     <w:lsdException w:name="heading 1" w:uiPriority="9" w:qFormat="1"/>
     <w:lsdException w:name="heading 2" w:semiHidden="1" w:uiPriority="9" w:unhideWhenUsed="1" w:qFormat="1"/>
@@ -2082,11 +2791,6 @@
     <w:lsdException w:name="List Table 5 Dark Accent 6" w:uiPriority="50"/>
     <w:lsdException w:name="List Table 6 Colorful Accent 6" w:uiPriority="51"/>
     <w:lsdException w:name="List Table 7 Colorful Accent 6" w:uiPriority="52"/>
-    <w:lsdException w:name="Mention" w:semiHidden="1" w:unhideWhenUsed="1"/>
-    <w:lsdException w:name="Smart Hyperlink" w:semiHidden="1" w:unhideWhenUsed="1"/>
-    <w:lsdException w:name="Hashtag" w:semiHidden="1" w:unhideWhenUsed="1"/>
-    <w:lsdException w:name="Unresolved Mention" w:semiHidden="1" w:unhideWhenUsed="1"/>
-    <w:lsdException w:name="Smart Link" w:semiHidden="1" w:unhideWhenUsed="1"/>
   </w:latentStyles>
   <w:style w:type="paragraph" w:default="1" w:styleId="a">
     <w:name w:val="Normal"/>
@@ -2904,4 +3608,16 @@
     </a:ext>
   </a:extLst>
 </a:theme>
+</file>
+
+<file path=customXml/item1.xml><?xml version="1.0" encoding="utf-8"?>
+<b:Sources xmlns:b="http://schemas.openxmlformats.org/officeDocument/2006/bibliography" xmlns="http://schemas.openxmlformats.org/officeDocument/2006/bibliography" SelectedStyle="\APASixthEditionOfficeOnline.xsl" StyleName="APA" Version="6"/>
+</file>
+
+<file path=customXml/itemProps1.xml><?xml version="1.0" encoding="utf-8"?>
+<ds:datastoreItem xmlns:ds="http://schemas.openxmlformats.org/officeDocument/2006/customXml" ds:itemID="{BAACCE82-FA1B-4A45-8734-E938DB8B994A}">
+  <ds:schemaRefs>
+    <ds:schemaRef ds:uri="http://schemas.openxmlformats.org/officeDocument/2006/bibliography"/>
+  </ds:schemaRefs>
+</ds:datastoreItem>
 </file>
</xml_diff>